<commit_message>
feat: audit BCB revisions in IDC reports
</commit_message>
<xml_diff>
--- a/outputs/report/template-docx/template.docx
+++ b/outputs/report/template-docx/template.docx
@@ -690,7 +690,25 @@
                 <w:i w:val="0"/>
                 <w:sz w:val="21"/>
               </w:rPr>
-              <w:t>I — Inadimplência da carteira de crédito livre PF (90+ dias)</w:t>
+              <w:t>I — Inadimplência da carteira de crédito livre PF (90</w:t>
+            </w:r>
+            <w:r>
+              <w:rPr>
+                <w:rFonts w:ascii="Arial" w:hAnsi="Arial"/>
+                <w:b w:val="0"/>
+                <w:i w:val="0"/>
+                <w:sz w:val="21"/>
+              </w:rPr>
+              <w:t>+</w:t>
+            </w:r>
+            <w:r>
+              <w:rPr>
+                <w:rFonts w:ascii="Palatino" w:hAnsi="Palatino"/>
+                <w:b w:val="0"/>
+                <w:i w:val="0"/>
+                <w:sz w:val="21"/>
+              </w:rPr>
+              <w:t xml:space="preserve"> dias)</w:t>
             </w:r>
           </w:p>
         </w:tc>
@@ -1515,9 +1533,19 @@
     </w:p>
     <w:p>
       <w:pPr>
+        <w:pStyle w:val="IDCNotes"/>
         <w:widowControl/>
-        <w:spacing w:line="300" w:lineRule="exact" w:before="0" w:after="0"/>
+        <w:spacing w:line="260" w:lineRule="exact" w:before="0" w:after="0"/>
         <w:ind w:firstLine="0"/>
+        <w:jc w:val="both"/>
+      </w:pPr>
+    </w:p>
+    <w:p>
+      <w:pPr>
+        <w:pStyle w:val="IDCNotes"/>
+        <w:widowControl/>
+        <w:spacing w:line="260" w:lineRule="exact" w:before="0" w:after="0"/>
+        <w:ind w:firstLine="300"/>
         <w:jc w:val="both"/>
       </w:pPr>
       <w:r>
@@ -1549,8 +1577,9 @@
     </w:p>
     <w:p>
       <w:pPr>
+        <w:pStyle w:val="IDCNotes"/>
         <w:widowControl/>
-        <w:spacing w:line="300" w:lineRule="exact" w:before="0" w:after="0"/>
+        <w:spacing w:line="260" w:lineRule="exact" w:before="0" w:after="0"/>
         <w:ind w:firstLine="300"/>
         <w:jc w:val="both"/>
       </w:pPr>
@@ -1576,13 +1605,14 @@
           <w:b w:val="0"/>
           <w:i w:val="0"/>
         </w:rPr>
-        <w:t xml:space="preserve"> FGVcemif/FGV-EAESP.</w:t>
+        <w:t xml:space="preserve"> FGVcemif/FGV-EAESP. </w:t>
       </w:r>
     </w:p>
     <w:p>
       <w:pPr>
+        <w:pStyle w:val="IDCNotes"/>
         <w:widowControl/>
-        <w:spacing w:line="300" w:lineRule="exact" w:before="0" w:after="0"/>
+        <w:spacing w:line="260" w:lineRule="exact" w:before="0" w:after="0"/>
         <w:ind w:firstLine="300"/>
         <w:jc w:val="both"/>
       </w:pPr>
@@ -14092,6 +14122,17 @@
       <w:i/>
       <w:color w:val="000000"/>
       <w:sz w:val="18"/>
+    </w:rPr>
+  </w:style>
+  <w:style w:type="paragraph" w:customStyle="1" w:styleId="IDCNotes">
+    <w:name w:val="IDC Notes"/>
+    <w:pPr>
+      <w:spacing w:line="260" w:lineRule="exact" w:before="0" w:after="0"/>
+    </w:pPr>
+    <w:rPr>
+      <w:rFonts w:ascii="Palatino" w:hAnsi="Palatino"/>
+      <w:color w:val="000000"/>
+      <w:sz w:val="19"/>
     </w:rPr>
   </w:style>
 </w:styles>

</xml_diff>

<commit_message>
data: update IDC to 202608 BCB release (Jun-2026)
IDC recedes to 0.959 (from a revised 0.983 in May-2026) as delinquency and costly-credit share decline.
</commit_message>
<xml_diff>
--- a/outputs/report/template-docx/template.docx
+++ b/outputs/report/template-docx/template.docx
@@ -1521,6 +1521,7 @@
     <w:p>
       <w:pPr>
         <w:pStyle w:val="Heading1"/>
+        <w:spacing w:before="240" w:after="80"/>
       </w:pPr>
       <w:r>
         <w:rPr>
@@ -1535,17 +1536,8 @@
       <w:pPr>
         <w:pStyle w:val="IDCNotes"/>
         <w:widowControl/>
-        <w:spacing w:line="260" w:lineRule="exact" w:before="0" w:after="0"/>
+        <w:spacing w:line="160" w:lineRule="exact" w:before="0" w:after="0"/>
         <w:ind w:firstLine="0"/>
-        <w:jc w:val="both"/>
-      </w:pPr>
-    </w:p>
-    <w:p>
-      <w:pPr>
-        <w:pStyle w:val="IDCNotes"/>
-        <w:widowControl/>
-        <w:spacing w:line="260" w:lineRule="exact" w:before="0" w:after="0"/>
-        <w:ind w:firstLine="300"/>
         <w:jc w:val="both"/>
       </w:pPr>
       <w:r>
@@ -1579,7 +1571,7 @@
       <w:pPr>
         <w:pStyle w:val="IDCNotes"/>
         <w:widowControl/>
-        <w:spacing w:line="260" w:lineRule="exact" w:before="0" w:after="0"/>
+        <w:spacing w:line="160" w:lineRule="exact" w:before="0" w:after="0"/>
         <w:ind w:firstLine="300"/>
         <w:jc w:val="both"/>
       </w:pPr>
@@ -1605,17 +1597,8 @@
           <w:b w:val="0"/>
           <w:i w:val="0"/>
         </w:rPr>
-        <w:t xml:space="preserve"> FGVcemif/FGV-EAESP. </w:t>
+        <w:t xml:space="preserve"> FGVcemif/FGV-EAESP.</w:t>
       </w:r>
-    </w:p>
-    <w:p>
-      <w:pPr>
-        <w:pStyle w:val="IDCNotes"/>
-        <w:widowControl/>
-        <w:spacing w:line="260" w:lineRule="exact" w:before="0" w:after="0"/>
-        <w:ind w:firstLine="300"/>
-        <w:jc w:val="both"/>
-      </w:pPr>
     </w:p>
     <w:p>
       <w:pPr>
@@ -14127,12 +14110,12 @@
   <w:style w:type="paragraph" w:customStyle="1" w:styleId="IDCNotes">
     <w:name w:val="IDC Notes"/>
     <w:pPr>
-      <w:spacing w:line="260" w:lineRule="exact" w:before="0" w:after="0"/>
+      <w:spacing w:line="160" w:lineRule="exact" w:before="0" w:after="0"/>
     </w:pPr>
     <w:rPr>
       <w:rFonts w:ascii="Palatino" w:hAnsi="Palatino"/>
       <w:color w:val="000000"/>
-      <w:sz w:val="19"/>
+      <w:sz w:val="13"/>
     </w:rPr>
   </w:style>
 </w:styles>

</xml_diff>

<commit_message>
report: regenerate IDC report deliverables
</commit_message>
<xml_diff>
--- a/outputs/report/template-docx/template.docx
+++ b/outputs/report/template-docx/template.docx
@@ -1536,7 +1536,7 @@
       <w:pPr>
         <w:pStyle w:val="IDCNotes"/>
         <w:widowControl/>
-        <w:spacing w:line="160" w:lineRule="exact" w:before="0" w:after="0"/>
+        <w:spacing w:line="260" w:lineRule="exact" w:before="0" w:after="0"/>
         <w:ind w:firstLine="0"/>
         <w:jc w:val="both"/>
       </w:pPr>
@@ -1571,7 +1571,24 @@
       <w:pPr>
         <w:pStyle w:val="IDCNotes"/>
         <w:widowControl/>
-        <w:spacing w:line="160" w:lineRule="exact" w:before="0" w:after="0"/>
+        <w:spacing w:line="260" w:lineRule="exact" w:before="0" w:after="0"/>
+        <w:ind w:firstLine="300"/>
+        <w:jc w:val="both"/>
+      </w:pPr>
+      <w:r>
+        <w:rPr>
+          <w:rFonts w:ascii="Palatino" w:hAnsi="Palatino"/>
+          <w:b w:val="0"/>
+          <w:i w:val="0"/>
+        </w:rPr>
+        <w:t>Revisões dos dados. Os valores históricos do IDC são recalculados a cada edição com a safra mais recente dos dados do Banco Central. Revisões com efeito material sobre o índice ou sua interpretação são descritas no relatório; a série disponibilizada incorpora todas as revisões identificadas.</w:t>
+      </w:r>
+    </w:p>
+    <w:p>
+      <w:pPr>
+        <w:pStyle w:val="IDCNotes"/>
+        <w:widowControl/>
+        <w:spacing w:line="260" w:lineRule="exact" w:before="0" w:after="0"/>
         <w:ind w:firstLine="300"/>
         <w:jc w:val="both"/>
       </w:pPr>
@@ -14110,12 +14127,12 @@
   <w:style w:type="paragraph" w:customStyle="1" w:styleId="IDCNotes">
     <w:name w:val="IDC Notes"/>
     <w:pPr>
-      <w:spacing w:line="160" w:lineRule="exact" w:before="0" w:after="0"/>
+      <w:spacing w:line="260" w:lineRule="exact" w:before="0" w:after="0"/>
     </w:pPr>
     <w:rPr>
       <w:rFonts w:ascii="Palatino" w:hAnsi="Palatino"/>
       <w:color w:val="000000"/>
-      <w:sz w:val="13"/>
+      <w:sz w:val="19"/>
     </w:rPr>
   </w:style>
 </w:styles>

</xml_diff>